<commit_message>
docs: update relatorio_final with summarize section
</commit_message>
<xml_diff>
--- a/docs/relatorio_final_migracao_azure.docx
+++ b/docs/relatorio_final_migracao_azure.docx
@@ -845,6 +845,32 @@
           <w:sz w:val="22"/>
         </w:rPr>
         <w:t>14</w:t>
+      </w:r>
+    </w:p>
+    <w:p>
+      <w:pPr>
+        <w:spacing w:after="80" w:line="312" w:lineRule="auto"/>
+        <w:ind w:left="0"/>
+      </w:pPr>
+      <w:r>
+        <w:rPr>
+          <w:b/>
+          <w:sz w:val="22"/>
+        </w:rPr>
+        <w:t>5. RESUMO DOS CUSTOS E PROGRESSO PARA CUSTO ZERO</w:t>
+      </w:r>
+      <w:r>
+        <w:rPr>
+          <w:color w:val="94A3B8"/>
+        </w:rPr>
+        <w:t xml:space="preserve"> ........... </w:t>
+      </w:r>
+      <w:r>
+        <w:rPr>
+          <w:b/>
+          <w:sz w:val="22"/>
+        </w:rPr>
+        <w:t>15</w:t>
       </w:r>
     </w:p>
     <w:p>
@@ -3076,6 +3102,490 @@
         <w:t>Considerando que a infraestrutura já se encontra corrigida (sem alocação de IPs públicos dedicados, sem zonas de DNS privado e com escala a zero rigorosamente ativa nos três contêineres), as operações ordinárias e manutenções do BioDash serão integralmente cobertas pela cota mensal renovada, mantendo o custo contínuo em R$ 0,00.</w:t>
       </w:r>
     </w:p>
+    <w:p>
+      <w:r>
+        <w:br w:type="page"/>
+      </w:r>
+    </w:p>
+    <w:p>
+      <w:pPr>
+        <w:keepNext/>
+        <w:spacing w:before="360" w:after="160"/>
+      </w:pPr>
+      <w:r>
+        <w:rPr>
+          <w:b/>
+          <w:color w:val="000000"/>
+          <w:sz w:val="26"/>
+        </w:rPr>
+        <w:t>5. RESUMO DOS CUSTOS E PROGRESSO PARA CUSTO ZERO</w:t>
+      </w:r>
+    </w:p>
+    <w:p>
+      <w:pPr>
+        <w:spacing w:line="360" w:lineRule="auto" w:after="120" w:before="0"/>
+        <w:jc w:val="both"/>
+      </w:pPr>
+      <w:r>
+        <w:rPr>
+          <w:b w:val="0"/>
+          <w:i w:val="0"/>
+          <w:color w:val="000000"/>
+          <w:sz w:val="24"/>
+        </w:rPr>
+        <w:t>A trajetória de governança e engenharia de custos (FinOps) no Microsoft Azure durante o desenvolvimento do BioDash foi orientada pelo objetivo de manter a infraestrutura de produção sob custo contínuo nulo (R$ 0,00), preservando integralmente o saldo de créditos da assinatura acadêmica Azure for Students.</w:t>
+      </w:r>
+    </w:p>
+    <w:p>
+      <w:pPr>
+        <w:spacing w:line="360" w:lineRule="auto" w:after="120" w:before="0"/>
+        <w:jc w:val="both"/>
+      </w:pPr>
+      <w:r>
+        <w:rPr>
+          <w:b w:val="0"/>
+          <w:i w:val="0"/>
+          <w:color w:val="000000"/>
+          <w:sz w:val="24"/>
+        </w:rPr>
+        <w:t>O progresso técnico percorrido pela equipe sintetiza-se nos seguintes marcos evolutivos:</w:t>
+      </w:r>
+    </w:p>
+    <w:p>
+      <w:pPr>
+        <w:spacing w:line="360" w:lineRule="auto" w:after="120" w:before="0"/>
+        <w:jc w:val="both"/>
+      </w:pPr>
+      <w:r>
+        <w:rPr>
+          <w:b w:val="0"/>
+          <w:i w:val="0"/>
+          <w:color w:val="000000"/>
+          <w:sz w:val="24"/>
+        </w:rPr>
+        <w:t>1. Diagnóstico de Custos Ocultos de Rede (02 a 12 de outubro): O acoplamento original dos contêineres a uma sub-rede dedicada na VNet acarretou o provisionamento implícito de um IP público padrão (R$ 2,03) e de uma zona DNS privada (R$ 0,26), ambos recursos tarifados sem cobertura acadêmica. Simultaneamente, a sequência inicial de testes e compilações consumiu a cota mensal de 180.000 vCPU-segundos gratuitos do Azure Container Apps, acumulando R$ 7,70 no início do mês.</w:t>
+      </w:r>
+    </w:p>
+    <w:p>
+      <w:pPr>
+        <w:spacing w:line="360" w:lineRule="auto" w:after="120" w:before="0"/>
+        <w:jc w:val="both"/>
+      </w:pPr>
+      <w:r>
+        <w:rPr>
+          <w:b w:val="0"/>
+          <w:i w:val="0"/>
+          <w:color w:val="000000"/>
+          <w:sz w:val="24"/>
+        </w:rPr>
+        <w:t>2. Desacoplamento Arquitetural de Rede via IaC Bicep (13 de outubro): Identificou-se que as aplicações serverless não necessitavam de subnet dedicada em VNet. Os modelos Bicep foram refatorados (commit 671d55c) para operar o Container Apps Environment em modo gerenciado serverless. Essa intervenção eliminou a dependência de IPs dedicados e zonas DNS privadas cobradas, zerando em 100% os custos recorrentes de rede.</w:t>
+      </w:r>
+    </w:p>
+    <w:p>
+      <w:pPr>
+        <w:spacing w:line="360" w:lineRule="auto" w:after="120" w:before="0"/>
+        <w:jc w:val="both"/>
+      </w:pPr>
+      <w:r>
+        <w:rPr>
+          <w:b w:val="0"/>
+          <w:i w:val="0"/>
+          <w:color w:val="000000"/>
+          <w:sz w:val="24"/>
+        </w:rPr>
+        <w:t>3. Calibração Rigorosa de Escala a Zero via KEDA: Todos os microsserviços (ca-biodash-api-prod, ca-biodash-web-prod e ca-biodash-ai-prod) receberam regras estritas de escalonamento: minReplicas: 0, maxReplicas: 1 e período de resfriamento de 300 segundos. Isso garantiu que instâncias ociosas fossem completamente desligadas, extinguindo qualquer cobrança de ociosidade (vCPU Idle Usage).</w:t>
+      </w:r>
+    </w:p>
+    <w:p>
+      <w:pPr>
+        <w:spacing w:line="360" w:lineRule="auto" w:after="120" w:before="0"/>
+        <w:jc w:val="both"/>
+      </w:pPr>
+      <w:r>
+        <w:rPr>
+          <w:b w:val="0"/>
+          <w:i w:val="0"/>
+          <w:color w:val="000000"/>
+          <w:sz w:val="24"/>
+        </w:rPr>
+        <w:t>4. Adequação das Cargas Persistentes à Camada Gratuita: O banco de dados relacional foi provisionado no Azure Database for PostgreSQL Flexible Server sob a computação Standard_B1ms (coberto pelas 750 horas mensais gratuitas). Da mesma forma, o armazenamento de arquivos no Azure Blob Storage e o workspace do Log Analytics tiveram todas as métricas rotuladas como - Free e valor de R$ 0,00.</w:t>
+      </w:r>
+    </w:p>
+    <w:p>
+      <w:pPr>
+        <w:spacing w:line="360" w:lineRule="auto" w:after="120" w:before="0"/>
+        <w:jc w:val="both"/>
+      </w:pPr>
+      <w:r>
+        <w:rPr>
+          <w:b w:val="0"/>
+          <w:i w:val="0"/>
+          <w:color w:val="000000"/>
+          <w:sz w:val="24"/>
+        </w:rPr>
+        <w:t>5. Achatamento da Curva e Operação Permanente a Custo Zero: A partir de 18 de outubro, a curva acumulada de custos estabilizou-se horizontalmente. O registro residual de R$ 1,91 aferido entre 14 e 23 de outubro (média de R$ 0,19/dia) correspondeu estritamente a validações pontuais pós-deploy das versões 0.19.x no GitHub Actions, após o esgotamento da cota mensal do período inicial. Com a renovação periódica das quotas gratuitas do Azure for Students a cada virada de mês, a infraestrutura operará em regime de custo zero contínuo.</w:t>
+      </w:r>
+    </w:p>
+    <w:tbl>
+      <w:tblPr>
+        <w:tblW w:type="auto" w:w="0"/>
+        <w:jc w:val="center"/>
+        <w:tblLayout w:type="fixed"/>
+        <w:tblLook w:firstColumn="1" w:firstRow="1" w:lastColumn="0" w:lastRow="0" w:noHBand="0" w:noVBand="1" w:val="04A0"/>
+      </w:tblPr>
+      <w:tblGrid>
+        <w:gridCol w:w="2423"/>
+        <w:gridCol w:w="2423"/>
+        <w:gridCol w:w="2423"/>
+        <w:gridCol w:w="2423"/>
+      </w:tblGrid>
+      <w:tr>
+        <w:tc>
+          <w:tcPr>
+            <w:tcW w:type="dxa" w:w="2423"/>
+            <w:shd w:fill="002060"/>
+          </w:tcPr>
+          <w:p>
+            <w:r>
+              <w:rPr>
+                <w:b/>
+                <w:color w:val="FFFFFF"/>
+                <w:sz w:val="19"/>
+              </w:rPr>
+              <w:t>Recurso / Camada</w:t>
+            </w:r>
+          </w:p>
+        </w:tc>
+        <w:tc>
+          <w:tcPr>
+            <w:tcW w:type="dxa" w:w="2423"/>
+            <w:shd w:fill="002060"/>
+          </w:tcPr>
+          <w:p>
+            <w:r>
+              <w:rPr>
+                <w:b/>
+                <w:color w:val="FFFFFF"/>
+                <w:sz w:val="19"/>
+              </w:rPr>
+              <w:t>Cenário Inicial</w:t>
+            </w:r>
+          </w:p>
+        </w:tc>
+        <w:tc>
+          <w:tcPr>
+            <w:tcW w:type="dxa" w:w="2423"/>
+            <w:shd w:fill="002060"/>
+          </w:tcPr>
+          <w:p>
+            <w:r>
+              <w:rPr>
+                <w:b/>
+                <w:color w:val="FFFFFF"/>
+                <w:sz w:val="19"/>
+              </w:rPr>
+              <w:t>Ação de Engenharia</w:t>
+            </w:r>
+          </w:p>
+        </w:tc>
+        <w:tc>
+          <w:tcPr>
+            <w:tcW w:type="dxa" w:w="2423"/>
+            <w:shd w:fill="002060"/>
+          </w:tcPr>
+          <w:p>
+            <w:r>
+              <w:rPr>
+                <w:b/>
+                <w:color w:val="FFFFFF"/>
+                <w:sz w:val="19"/>
+              </w:rPr>
+              <w:t>Status Atual (FinOps)</w:t>
+            </w:r>
+          </w:p>
+        </w:tc>
+      </w:tr>
+      <w:tr>
+        <w:tc>
+          <w:tcPr>
+            <w:tcW w:type="dxa" w:w="2423"/>
+          </w:tcPr>
+          <w:p>
+            <w:r>
+              <w:rPr>
+                <w:b/>
+                <w:sz w:val="19"/>
+              </w:rPr>
+              <w:t>Azure Container Apps</w:t>
+            </w:r>
+          </w:p>
+        </w:tc>
+        <w:tc>
+          <w:tcPr>
+            <w:tcW w:type="dxa" w:w="2423"/>
+          </w:tcPr>
+          <w:p>
+            <w:r>
+              <w:rPr>
+                <w:sz w:val="19"/>
+              </w:rPr>
+              <w:t>Risco de réplicas ativas ociosas e estouro de cota</w:t>
+            </w:r>
+          </w:p>
+        </w:tc>
+        <w:tc>
+          <w:tcPr>
+            <w:tcW w:type="dxa" w:w="2423"/>
+          </w:tcPr>
+          <w:p>
+            <w:r>
+              <w:rPr>
+                <w:sz w:val="19"/>
+              </w:rPr>
+              <w:t>Configuração de minReplicas: 0, maxReplicas: 1 e cooldown de 300s via KEDA</w:t>
+            </w:r>
+          </w:p>
+        </w:tc>
+        <w:tc>
+          <w:tcPr>
+            <w:tcW w:type="dxa" w:w="2423"/>
+          </w:tcPr>
+          <w:p>
+            <w:r>
+              <w:rPr>
+                <w:b/>
+                <w:sz w:val="19"/>
+              </w:rPr>
+              <w:t>Escala a zero ativa (R$ 0,00 ocioso)</w:t>
+            </w:r>
+          </w:p>
+        </w:tc>
+      </w:tr>
+      <w:tr>
+        <w:tc>
+          <w:tcPr>
+            <w:tcW w:type="dxa" w:w="2423"/>
+          </w:tcPr>
+          <w:p>
+            <w:r>
+              <w:rPr>
+                <w:b/>
+                <w:sz w:val="19"/>
+              </w:rPr>
+              <w:t>Rede e Conectividade</w:t>
+            </w:r>
+          </w:p>
+        </w:tc>
+        <w:tc>
+          <w:tcPr>
+            <w:tcW w:type="dxa" w:w="2423"/>
+          </w:tcPr>
+          <w:p>
+            <w:r>
+              <w:rPr>
+                <w:sz w:val="19"/>
+              </w:rPr>
+              <w:t>Alocação de IP Público Standard na VNet (R$ 2,03)</w:t>
+            </w:r>
+          </w:p>
+        </w:tc>
+        <w:tc>
+          <w:tcPr>
+            <w:tcW w:type="dxa" w:w="2423"/>
+          </w:tcPr>
+          <w:p>
+            <w:r>
+              <w:rPr>
+                <w:sz w:val="19"/>
+              </w:rPr>
+              <w:t>Desacoplamento da VNet nos arquivos Bicep (commit 671d55c)</w:t>
+            </w:r>
+          </w:p>
+        </w:tc>
+        <w:tc>
+          <w:tcPr>
+            <w:tcW w:type="dxa" w:w="2423"/>
+          </w:tcPr>
+          <w:p>
+            <w:r>
+              <w:rPr>
+                <w:b/>
+                <w:sz w:val="19"/>
+              </w:rPr>
+              <w:t>0 IPs Públicos (R$ 0,00)</w:t>
+            </w:r>
+          </w:p>
+        </w:tc>
+      </w:tr>
+      <w:tr>
+        <w:tc>
+          <w:tcPr>
+            <w:tcW w:type="dxa" w:w="2423"/>
+          </w:tcPr>
+          <w:p>
+            <w:r>
+              <w:rPr>
+                <w:b/>
+                <w:sz w:val="19"/>
+              </w:rPr>
+              <w:t>Resolução de Nomes (DNS)</w:t>
+            </w:r>
+          </w:p>
+        </w:tc>
+        <w:tc>
+          <w:tcPr>
+            <w:tcW w:type="dxa" w:w="2423"/>
+          </w:tcPr>
+          <w:p>
+            <w:r>
+              <w:rPr>
+                <w:sz w:val="19"/>
+              </w:rPr>
+              <w:t>Zona Privada do PostgreSQL tarifada (R$ 0,26)</w:t>
+            </w:r>
+          </w:p>
+        </w:tc>
+        <w:tc>
+          <w:tcPr>
+            <w:tcW w:type="dxa" w:w="2423"/>
+          </w:tcPr>
+          <w:p>
+            <w:r>
+              <w:rPr>
+                <w:sz w:val="19"/>
+              </w:rPr>
+              <w:t>Remoção de links de rede privada desnecessários no Bicep</w:t>
+            </w:r>
+          </w:p>
+        </w:tc>
+        <w:tc>
+          <w:tcPr>
+            <w:tcW w:type="dxa" w:w="2423"/>
+          </w:tcPr>
+          <w:p>
+            <w:r>
+              <w:rPr>
+                <w:b/>
+                <w:sz w:val="19"/>
+              </w:rPr>
+              <w:t>0 Zonas DNS (R$ 0,00)</w:t>
+            </w:r>
+          </w:p>
+        </w:tc>
+      </w:tr>
+      <w:tr>
+        <w:tc>
+          <w:tcPr>
+            <w:tcW w:type="dxa" w:w="2423"/>
+          </w:tcPr>
+          <w:p>
+            <w:r>
+              <w:rPr>
+                <w:b/>
+                <w:sz w:val="19"/>
+              </w:rPr>
+              <w:t>Base Relacional (PostgreSQL)</w:t>
+            </w:r>
+          </w:p>
+        </w:tc>
+        <w:tc>
+          <w:tcPr>
+            <w:tcW w:type="dxa" w:w="2423"/>
+          </w:tcPr>
+          <w:p>
+            <w:r>
+              <w:rPr>
+                <w:sz w:val="19"/>
+              </w:rPr>
+              <w:t>Risco de tarifação fora do limite de computação</w:t>
+            </w:r>
+          </w:p>
+        </w:tc>
+        <w:tc>
+          <w:tcPr>
+            <w:tcW w:type="dxa" w:w="2423"/>
+          </w:tcPr>
+          <w:p>
+            <w:r>
+              <w:rPr>
+                <w:sz w:val="19"/>
+              </w:rPr>
+              <w:t>Provisionamento calibrado no tier Standard_B1ms com SSL obrigatório</w:t>
+            </w:r>
+          </w:p>
+        </w:tc>
+        <w:tc>
+          <w:tcPr>
+            <w:tcW w:type="dxa" w:w="2423"/>
+          </w:tcPr>
+          <w:p>
+            <w:r>
+              <w:rPr>
+                <w:b/>
+                <w:sz w:val="19"/>
+              </w:rPr>
+              <w:t>100% coberto pelo tier gratuito (R$ 0,00)</w:t>
+            </w:r>
+          </w:p>
+        </w:tc>
+      </w:tr>
+      <w:tr>
+        <w:tc>
+          <w:tcPr>
+            <w:tcW w:type="dxa" w:w="2423"/>
+          </w:tcPr>
+          <w:p>
+            <w:r>
+              <w:rPr>
+                <w:b/>
+                <w:sz w:val="19"/>
+              </w:rPr>
+              <w:t>Blob Storage e Telemetria</w:t>
+            </w:r>
+          </w:p>
+        </w:tc>
+        <w:tc>
+          <w:tcPr>
+            <w:tcW w:type="dxa" w:w="2423"/>
+          </w:tcPr>
+          <w:p>
+            <w:r>
+              <w:rPr>
+                <w:sz w:val="19"/>
+              </w:rPr>
+              <w:t>Risco de operações fora da franquia</w:t>
+            </w:r>
+          </w:p>
+        </w:tc>
+        <w:tc>
+          <w:tcPr>
+            <w:tcW w:type="dxa" w:w="2423"/>
+          </w:tcPr>
+          <w:p>
+            <w:r>
+              <w:rPr>
+                <w:sz w:val="19"/>
+              </w:rPr>
+              <w:t>Uso de SAS tokens com cabeçalho BlockBlob e retenção calibrada</w:t>
+            </w:r>
+          </w:p>
+        </w:tc>
+        <w:tc>
+          <w:tcPr>
+            <w:tcW w:type="dxa" w:w="2423"/>
+          </w:tcPr>
+          <w:p>
+            <w:r>
+              <w:rPr>
+                <w:b/>
+                <w:sz w:val="19"/>
+              </w:rPr>
+              <w:t>Métricas rotuladas - Free (R$ 0,00)</w:t>
+            </w:r>
+          </w:p>
+        </w:tc>
+      </w:tr>
+    </w:tbl>
     <w:sectPr>
       <w:pgSz w:w="12240" w:h="15840"/>
       <w:pgMar w:top="1411" w:right="1138" w:bottom="1138" w:left="1411" w:header="720" w:footer="720" w:gutter="0"/>

</xml_diff>